<commit_message>
Atualiza documentacao com link do repositorio do aluno
</commit_message>
<xml_diff>
--- a/projeto_spring_boot_info.docx
+++ b/projeto_spring_boot_info.docx
@@ -40,7 +40,7 @@
           <w:sz w:val="28"/>
           <w:color w:val="1F497D"/>
         </w:rPr>
-        <w:t>1. InformaÃ§Ãµes do Projeto</w:t>
+        <w:t>1. Links do Projeto e Entrega</w:t>
       </w:r>
     </w:p>
     <w:p>
@@ -48,7 +48,18 @@
         <w:rPr>
           <w:b/>
         </w:rPr>
-        <w:t>RepositÃ³rio Base no GitHub: </w:t>
+        <w:t>Link do RepositÃ³rio GitHub (Entrega): </w:t>
+      </w:r>
+      <w:r>
+        <w:t>https://github.com/edneyfontenele/projeto-.git</w:t>
+      </w:r>
+    </w:p>
+    <w:p>
+      <w:r>
+        <w:rPr>
+          <w:b/>
+        </w:rPr>
+        <w:t>RepositÃ³rio Base Original (Professor): </w:t>
       </w:r>
       <w:r>
         <w:t>https://github.com/profjppimentel/gerenciamento-alunos-crud-springboot-master.git</w:t>
@@ -59,7 +70,7 @@
         <w:rPr>
           <w:b/>
         </w:rPr>
-        <w:t>Arquivo Compactado: </w:t>
+        <w:t>Arquivo Compactado (.ZIP): </w:t>
       </w:r>
       <w:r>
         <w:t>gerenciamento-alunos-com-enade-e-email.zip</w:t>
@@ -137,7 +148,7 @@
           <w:sz w:val="28"/>
           <w:color w:val="1F497D"/>
         </w:rPr>
-        <w:t>3. Como Iniciar o Banco no Docker</w:t>
+        <w:t>3. Como Iniciar Tudo no Docker</w:t>
       </w:r>
     </w:p>
     <w:p>
@@ -155,35 +166,12 @@
     </w:p>
     <w:p>
       <w:r>
-        <w:t>Acesso ao phpMyAdmin: http://localhost:8080 (usuÃ¡rio: root, senha: root)</w:t>
-      </w:r>
-    </w:p>
-    <w:p>
-      <w:pPr>
-        <w:spacing w:before="200" w:after="100"/>
-      </w:pPr>
-      <w:r>
-        <w:rPr>
-          <w:b/>
-          <w:sz w:val="28"/>
-          <w:color w:val="1F497D"/>
-        </w:rPr>
-        <w:t>4. ExecuÃ§Ã£o do Projeto Spring Boot</w:t>
+        <w:t>Acesso Ã  AplicaÃ§Ã£o Web: http://localhost:8082</w:t>
       </w:r>
     </w:p>
     <w:p>
       <w:r>
-        <w:t>1. Importe a pasta 'gerenciamento-alunos-crud-springboot' no Eclipse ou VS Code.</w:t>
-      </w:r>
-    </w:p>
-    <w:p>
-      <w:r>
-        <w:t>2. Execute 'GerenciamentoAlunosApplication.java'.</w:t>
-      </w:r>
-    </w:p>
-    <w:p>
-      <w:r>
-        <w:t>3. Acesse http://localhost:8082 no navegador.</w:t>
+        <w:t>Acesso ao phpMyAdmin: http://localhost:8081 (usuÃ¡rio: root, senha: root)</w:t>
       </w:r>
     </w:p>
     <w:p>

</xml_diff>